<commit_message>
Correcciones en objetivos, ajuste de la nueva tecnología frontend
</commit_message>
<xml_diff>
--- a/Actividades/Actividad_1.docx
+++ b/Actividades/Actividad_1.docx
@@ -929,14 +929,10 @@
         <w:rPr/>
       </w:pPr>
       <w:r>
-        <w:t xml:space="preserve">Desarrollar un sistema web para el agendamiento y recordatorio de citas del centro odontológico </w:t>
+        <w:t>Desarrollar un sistema web que optimice la gestión de citas del centro odontológico Villadent.</w:t>
       </w:r>
-      <w:r>
-        <w:t xml:space="preserve">Villadent</w:t>
-      </w:r>
-      <w:r>
-        <w:t xml:space="preserve">, que permita digitalizar la gestión de horarios y reducir la ausencia  mediante notificaciones automáticas.</w:t>
-      </w:r>
+      <w:r/>
+      <w:r/>
       <w:r/>
     </w:p>
     <w:p>
@@ -971,14 +967,10 @@
         <w:rPr/>
       </w:pPr>
       <w:r>
-        <w:t xml:space="preserve">Identificar los requerimientos funcionales y no funcionales del sistema mediante una entrevista estructurada en el centro odontológico </w:t>
+        <w:t>Identificar los requerimientos funcionales y no funcionales del sistema mediante entrevistas estructuradas con el personal del centro odontológico Villadent, para contar con una base sólida que oriente el diseño de la solución.</w:t>
       </w:r>
-      <w:r>
-        <w:t xml:space="preserve">Villadent</w:t>
-      </w:r>
-      <w:r>
-        <w:t xml:space="preserve">, para contar con una base sólida que oriente el diseño de la solución.</w:t>
-      </w:r>
+      <w:r/>
+      <w:r/>
       <w:r/>
     </w:p>
     <w:p>
@@ -1011,11 +1003,9 @@
         <w:rPr/>
       </w:pPr>
       <w:r>
-        <w:t xml:space="preserve">Desarrollar los módulos de agendamiento en línea y de recordatorios automáticos (Whats</w:t>
+        <w:t>Implementar los módulos de agendamiento en línea y de recordatorios automáticos (WhatsApp) siguiendo el diseño arquitectónico definido y aplicando el enfoque basado en prototipos de la metodología RAD, para refinar continuamente la interfaz y las funciones del sistema mediante la retroalimentación directa y temprana de los usuarios finales.</w:t>
       </w:r>
-      <w:r>
-        <w:t xml:space="preserve">App) siguiendo el diseño arquitectónico definido y aplicando el enfoque basado en prototipos de la metodología RAD, para refinar continuamente la interfaz y las funciones del sistema mediante la retroalimentación directa y temprana de los usuarios finales.</w:t>
-      </w:r>
+      <w:r/>
       <w:r/>
     </w:p>
     <w:p>
@@ -1566,11 +1556,9 @@
         <w:rPr/>
       </w:pPr>
       <w:r>
-        <w:t xml:space="preserve">Con base en la entrevista realizada a la auxiliar administrativa de </w:t>
+        <w:t>Con base en las entrevistas realizadas al personal del centro odontológico Villadent</w:t>
       </w:r>
-      <w:r>
-        <w:t xml:space="preserve">Villadent</w:t>
-      </w:r>
+      <w:r/>
       <w:r>
         <w:t xml:space="preserve">, a continuación se presentan los requisitos funcionales y no funcionales identificados para el sistema.</w:t>
       </w:r>

</xml_diff>

<commit_message>
docs: drop the patient login from RF09 and update the test plan to version 1.2
The patient never signs in: staff keep the auxiliar and odontologo roles, and the patient manages an appointment through the personal link in the WhatsApp reminder. RF09 changes in the project document and in Actividades 1 and 3.

The module 2 test plan goes to version 1.2 with 44 cases, after validating it against the requirements and the prototype: 45 and 90 minute durations, the morning/afternoon reminder boundary, the immediate reminder when its time has already passed, retry limits, an invalid manage link, a slot taken while rescheduling, an active appointment on manual booking, RNF01, and patient data exposure for RNF03.

Versions 1.3 and 1.4 of the change-control table record both decisions.
</commit_message>
<xml_diff>
--- a/Actividades/Actividad_1.docx
+++ b/Actividades/Actividad_1.docx
@@ -7339,7 +7339,7 @@
                   <w:rPr/>
                 </w:pPr>
                 <w:r>
-                  <w:t xml:space="preserve">El sistema debe permitir el inicio de sesión y distinguir al menos tres roles (odontólogo, auxiliar, paciente), restringiendo el acceso a datos de pacientes e historial de citas según el rol autenticado.</w:t>
+                  <w:t>El sistema debe permitir el inicio de sesión del personal y distinguir sus roles (odontólogo y auxiliar), restringiendo el acceso a datos de pacientes e historial de citas según el rol autenticado. El paciente no inicia sesión: agenda desde la web pública y gestiona su cita con el enlace personal que recibe en el recordatorio.</w:t>
                 </w:r>
                 <w:r/>
               </w:p>
@@ -7473,7 +7473,7 @@
                   <w:rPr/>
                 </w:pPr>
                 <w:r>
-                  <w:t xml:space="preserve">Sesión iniciada con permisos correspondientes al rol; acceso denegado si las credenciales o el ro no son válidos</w:t>
+                  <w:t>Sesión iniciada con permisos correspondientes al rol; acceso denegado si las credenciales o el rol no son válidos</w:t>
                 </w:r>
                 <w:r/>
               </w:p>
@@ -7607,7 +7607,7 @@
                   <w:rPr/>
                 </w:pPr>
                 <w:r>
-                  <w:t xml:space="preserve">Dado que un usuario ingresa con credenciales de "paciente", cuando intenta acceder a la ruta web de reportes administrativos, entonces el frontend debe redirigirlo y el backend devolver un error HTTP 403.</w:t>
+                  <w:t>Dado que un usuario ingresa con credenciales de "odontólogo", cuando intenta acceder a la ruta web de reportes administrativos, exclusiva de la auxiliar, entonces el frontend debe redirigirlo y el backend devolver un error HTTP 403.</w:t>
                 </w:r>
                 <w:r/>
               </w:p>

</xml_diff>